<commit_message>
Causal feature mart & emissions boundary
</commit_message>
<xml_diff>
--- a/docs/causal_energy_methodology_interview_handbook.docx
+++ b/docs/causal_energy_methodology_interview_handbook.docx
@@ -3727,6 +3727,118 @@
     </w:p>
     <w:p>
       <w:pPr>
+        <w:widowControl/>
+      </w:pPr>
+      <w:r>
+        <w:rPr>
+          <w:rFonts w:ascii="Liberation Sans" w:hAnsi="Liberation Sans"/>
+        </w:rPr>
+        <w:t>The first ENTSO-E data contract covers France and its directly connected bidding zones. It stores</w:t>
+      </w:r>
+    </w:p>
+    <w:p>
+      <w:pPr>
+        <w:widowControl/>
+      </w:pPr>
+      <w:r>
+        <w:rPr>
+          <w:rFonts w:ascii="Liberation Sans" w:hAnsi="Liberation Sans"/>
+        </w:rPr>
+        <w:t>directional physical flows, scheduled exchanges, transfer capacity, versioned load and renewable</w:t>
+      </w:r>
+    </w:p>
+    <w:p>
+      <w:pPr>
+        <w:widowControl/>
+      </w:pPr>
+      <w:r>
+        <w:rPr>
+          <w:rFonts w:ascii="Liberation Sans" w:hAnsi="Liberation Sans"/>
+        </w:rPr>
+        <w:t>forecasts, outage revisions, and native-resolution balancing data. Operational forecast snapshots</w:t>
+      </w:r>
+    </w:p>
+    <w:p>
+      <w:pPr>
+        <w:widowControl/>
+      </w:pPr>
+      <w:r>
+        <w:rPr>
+          <w:rFonts w:ascii="Liberation Sans" w:hAnsi="Liberation Sans"/>
+        </w:rPr>
+        <w:t>can be joined to later settled actuals to measure what the system genuinely knew at decision time.</w:t>
+      </w:r>
+    </w:p>
+    <w:p>
+      <w:pPr>
+        <w:widowControl/>
+      </w:pPr>
+      <w:r>
+        <w:rPr>
+          <w:rFonts w:ascii="Liberation Sans" w:hAnsi="Liberation Sans"/>
+        </w:rPr>
+        <w:t xml:space="preserve">Historical downloads are marked </w:t>
+      </w:r>
+      <w:r>
+        <w:rPr>
+          <w:rFonts w:ascii="Liberation Mono" w:hAnsi="Liberation Mono"/>
+          <w:sz w:val="19"/>
+        </w:rPr>
+        <w:t>historical_final</w:t>
+      </w:r>
+      <w:r>
+        <w:rPr>
+          <w:rFonts w:ascii="Liberation Sans" w:hAnsi="Liberation Sans"/>
+        </w:rPr>
+        <w:t>: they help exploratory modeling, but they do not</w:t>
+      </w:r>
+    </w:p>
+    <w:p>
+      <w:pPr>
+        <w:widowControl/>
+      </w:pPr>
+      <w:r>
+        <w:rPr>
+          <w:rFonts w:ascii="Liberation Sans" w:hAnsi="Liberation Sans"/>
+        </w:rPr>
+        <w:t>prove that the same forecast vintage was available at a past decision time.</w:t>
+      </w:r>
+    </w:p>
+    <w:p>
+      <w:pPr>
+        <w:widowControl/>
+      </w:pPr>
+      <w:r>
+        <w:rPr>
+          <w:rFonts w:ascii="Liberation Sans" w:hAnsi="Liberation Sans"/>
+        </w:rPr>
+        <w:t>Analogy: an operational snapshot is a photograph taken before the match; a historical final value is</w:t>
+      </w:r>
+    </w:p>
+    <w:p>
+      <w:pPr>
+        <w:widowControl/>
+      </w:pPr>
+      <w:r>
+        <w:rPr>
+          <w:rFonts w:ascii="Liberation Sans" w:hAnsi="Liberation Sans"/>
+        </w:rPr>
+        <w:t>the edited match report. Both contain useful information, but only the photograph can establish what</w:t>
+      </w:r>
+    </w:p>
+    <w:p>
+      <w:pPr>
+        <w:widowControl/>
+      </w:pPr>
+      <w:r>
+        <w:rPr>
+          <w:rFonts w:ascii="Liberation Sans" w:hAnsi="Liberation Sans"/>
+        </w:rPr>
+        <w:t>was visible before play began.</w:t>
+      </w:r>
+    </w:p>
+    <w:p>
+      <w:pPr>
         <w:pStyle w:val="Heading2"/>
         <w:keepNext/>
       </w:pPr>
@@ -3734,7 +3846,7 @@
         <w:rPr>
           <w:rFonts w:ascii="Liberation Sans" w:hAnsi="Liberation Sans"/>
         </w:rPr>
-        <w:t>Constrained Marginal Response Regression</w:t>
+        <w:t>Causal Feature Mart And Readiness Gate</w:t>
       </w:r>
     </w:p>
     <w:p>
@@ -3745,7 +3857,347 @@
         <w:rPr>
           <w:rFonts w:ascii="Liberation Sans" w:hAnsi="Liberation Sans"/>
         </w:rPr>
-        <w:t>The first estimator should model how generation technologies and connected zones respond to changes in French net load while controlling for pre-decision conditions. Physical constraints can regularize the estimates. Total marginal response should approximately balance the demand change, subject to storage, losses, and imports. Sign and monotonicity assumptions must be tested by regime rather than imposed blindly.</w:t>
+        <w:t>The historical inputs are assembled into one hourly causal feature mart. Each column is named by</w:t>
+      </w:r>
+    </w:p>
+    <w:p>
+      <w:pPr>
+        <w:widowControl/>
+      </w:pPr>
+      <w:r>
+        <w:rPr>
+          <w:rFonts w:ascii="Liberation Sans" w:hAnsi="Liberation Sans"/>
+        </w:rPr>
+        <w:t xml:space="preserve">its role: </w:t>
+      </w:r>
+      <w:r>
+        <w:rPr>
+          <w:rFonts w:ascii="Liberation Mono" w:hAnsi="Liberation Mono"/>
+          <w:sz w:val="19"/>
+        </w:rPr>
+        <w:t>pre_</w:t>
+      </w:r>
+      <w:r>
+        <w:rPr>
+          <w:rFonts w:ascii="Liberation Sans" w:hAnsi="Liberation Sans"/>
+        </w:rPr>
+        <w:t xml:space="preserve"> for possible pre-treatment controls, </w:t>
+      </w:r>
+      <w:r>
+        <w:rPr>
+          <w:rFonts w:ascii="Liberation Mono" w:hAnsi="Liberation Mono"/>
+          <w:sz w:val="19"/>
+        </w:rPr>
+        <w:t>treatment_proxy_</w:t>
+      </w:r>
+      <w:r>
+        <w:rPr>
+          <w:rFonts w:ascii="Liberation Sans" w:hAnsi="Liberation Sans"/>
+        </w:rPr>
+        <w:t xml:space="preserve"> for the observed load</w:t>
+      </w:r>
+    </w:p>
+    <w:p>
+      <w:pPr>
+        <w:widowControl/>
+      </w:pPr>
+      <w:r>
+        <w:rPr>
+          <w:rFonts w:ascii="Liberation Sans" w:hAnsi="Liberation Sans"/>
+        </w:rPr>
+        <w:t xml:space="preserve">innovation, </w:t>
+      </w:r>
+      <w:r>
+        <w:rPr>
+          <w:rFonts w:ascii="Liberation Mono" w:hAnsi="Liberation Mono"/>
+          <w:sz w:val="19"/>
+        </w:rPr>
+        <w:t>outcome_</w:t>
+      </w:r>
+      <w:r>
+        <w:rPr>
+          <w:rFonts w:ascii="Liberation Sans" w:hAnsi="Liberation Sans"/>
+        </w:rPr>
+        <w:t xml:space="preserve"> for emissions, </w:t>
+      </w:r>
+      <w:r>
+        <w:rPr>
+          <w:rFonts w:ascii="Liberation Mono" w:hAnsi="Liberation Mono"/>
+          <w:sz w:val="19"/>
+        </w:rPr>
+        <w:t>mediator_</w:t>
+      </w:r>
+      <w:r>
+        <w:rPr>
+          <w:rFonts w:ascii="Liberation Sans" w:hAnsi="Liberation Sans"/>
+        </w:rPr>
+        <w:t xml:space="preserve"> for grid responses such as physical flows and</w:t>
+      </w:r>
+    </w:p>
+    <w:p>
+      <w:pPr>
+        <w:widowControl/>
+      </w:pPr>
+      <w:r>
+        <w:rPr>
+          <w:rFonts w:ascii="Liberation Sans" w:hAnsi="Liberation Sans"/>
+        </w:rPr>
+        <w:t xml:space="preserve">balancing, and </w:t>
+      </w:r>
+      <w:r>
+        <w:rPr>
+          <w:rFonts w:ascii="Liberation Mono" w:hAnsi="Liberation Mono"/>
+          <w:sz w:val="19"/>
+        </w:rPr>
+        <w:t>diagnostic_</w:t>
+      </w:r>
+      <w:r>
+        <w:rPr>
+          <w:rFonts w:ascii="Liberation Sans" w:hAnsi="Liberation Sans"/>
+        </w:rPr>
+        <w:t xml:space="preserve"> for settled values that must not be adjusted away. Forecast errors are</w:t>
+      </w:r>
+    </w:p>
+    <w:p>
+      <w:pPr>
+        <w:widowControl/>
+      </w:pPr>
+      <w:r>
+        <w:rPr>
+          <w:rFonts w:ascii="Liberation Sans" w:hAnsi="Liberation Sans"/>
+        </w:rPr>
+        <w:t>safe controls only after they are lagged; the same-hour error is known after the response begins.</w:t>
+      </w:r>
+    </w:p>
+    <w:p>
+      <w:pPr>
+        <w:widowControl/>
+      </w:pPr>
+      <w:r>
+        <w:rPr>
+          <w:rFonts w:ascii="Liberation Sans" w:hAnsi="Liberation Sans"/>
+        </w:rPr>
+        <w:t>The France outcome sums settled source generation multiplied by the versioned direct-operational</w:t>
+      </w:r>
+    </w:p>
+    <w:p>
+      <w:pPr>
+        <w:widowControl/>
+      </w:pPr>
+      <w:r>
+        <w:rPr>
+          <w:rFonts w:ascii="Liberation Sans" w:hAnsi="Liberation Sans"/>
+        </w:rPr>
+        <w:t>emission factors. Published average carbon intensity remains a diagnostic rather than replacing</w:t>
+      </w:r>
+    </w:p>
+    <w:p>
+      <w:pPr>
+        <w:widowControl/>
+      </w:pPr>
+      <w:r>
+        <w:rPr>
+          <w:rFonts w:ascii="Liberation Sans" w:hAnsi="Liberation Sans"/>
+        </w:rPr>
+        <w:t>that declared outcome.</w:t>
+      </w:r>
+    </w:p>
+    <w:p>
+      <w:pPr>
+        <w:widowControl/>
+      </w:pPr>
+      <w:r>
+        <w:rPr>
+          <w:rFonts w:ascii="Liberation Sans" w:hAnsi="Liberation Sans"/>
+        </w:rPr>
+        <w:t>The agreed spatial boundary is implemented with hourly generation for Belgium,</w:t>
+      </w:r>
+    </w:p>
+    <w:p>
+      <w:pPr>
+        <w:widowControl/>
+      </w:pPr>
+      <w:r>
+        <w:rPr>
+          <w:rFonts w:ascii="Liberation Sans" w:hAnsi="Liberation Sans"/>
+        </w:rPr>
+        <w:t>Germany-Luxembourg, Switzerland, Northern Italy, Spain, and Great Britain. ENTSO-E supplies the</w:t>
+      </w:r>
+    </w:p>
+    <w:p>
+      <w:pPr>
+        <w:widowControl/>
+      </w:pPr>
+      <w:r>
+        <w:rPr>
+          <w:rFonts w:ascii="Liberation Sans" w:hAnsi="Liberation Sans"/>
+        </w:rPr>
+        <w:t>continental production mix, while Elexon supplies Great Britain because the equivalent ENTSO-E</w:t>
+      </w:r>
+    </w:p>
+    <w:p>
+      <w:pPr>
+        <w:widowControl/>
+      </w:pPr>
+      <w:r>
+        <w:rPr>
+          <w:rFonts w:ascii="Liberation Sans" w:hAnsi="Liberation Sans"/>
+        </w:rPr>
+        <w:t>query is unavailable. Each zone is converted to point, lower, and upper direct-emissions outcomes.</w:t>
+      </w:r>
+    </w:p>
+    <w:p>
+      <w:pPr>
+        <w:widowControl/>
+      </w:pPr>
+      <w:r>
+        <w:rPr>
+          <w:rFonts w:ascii="Liberation Sans" w:hAnsi="Liberation Sans"/>
+        </w:rPr>
+        <w:t>Heterogeneous Other generation receives a wide factor range, and a coverage gate prevents a</w:t>
+      </w:r>
+    </w:p>
+    <w:p>
+      <w:pPr>
+        <w:widowControl/>
+      </w:pPr>
+      <w:r>
+        <w:rPr>
+          <w:rFonts w:ascii="Liberation Sans" w:hAnsi="Liberation Sans"/>
+        </w:rPr>
+        <w:t>missing zone from being interpreted as zero emissions.</w:t>
+      </w:r>
+    </w:p>
+    <w:p>
+      <w:pPr>
+        <w:widowControl/>
+      </w:pPr>
+      <w:r>
+        <w:rPr>
+          <w:rFonts w:ascii="Liberation Sans" w:hAnsi="Liberation Sans"/>
+        </w:rPr>
+        <w:t>Elexon relies on operationally metered generation and underrepresents embedded renewables, so this</w:t>
+      </w:r>
+    </w:p>
+    <w:p>
+      <w:pPr>
+        <w:widowControl/>
+      </w:pPr>
+      <w:r>
+        <w:rPr>
+          <w:rFonts w:ascii="Liberation Sans" w:hAnsi="Liberation Sans"/>
+        </w:rPr>
+        <w:t>measurement limitation remains explicit even after the geographic boundary is populated.</w:t>
+      </w:r>
+    </w:p>
+    <w:p>
+      <w:pPr>
+        <w:widowControl/>
+      </w:pPr>
+      <w:r>
+        <w:rPr>
+          <w:rFonts w:ascii="Liberation Sans" w:hAnsi="Liberation Sans"/>
+        </w:rPr>
+        <w:t>Analogy: the mart is a courtroom evidence table. Information available before the event goes in one</w:t>
+      </w:r>
+    </w:p>
+    <w:p>
+      <w:pPr>
+        <w:widowControl/>
+      </w:pPr>
+      <w:r>
+        <w:rPr>
+          <w:rFonts w:ascii="Liberation Sans" w:hAnsi="Liberation Sans"/>
+        </w:rPr>
+        <w:t>folder, what happened during the event goes in another, and the final outcome goes in a third. The</w:t>
+      </w:r>
+    </w:p>
+    <w:p>
+      <w:pPr>
+        <w:widowControl/>
+      </w:pPr>
+      <w:r>
+        <w:rPr>
+          <w:rFonts w:ascii="Liberation Sans" w:hAnsi="Liberation Sans"/>
+        </w:rPr>
+        <w:t>labels stop us from accidentally using the outcome to explain itself.</w:t>
+      </w:r>
+    </w:p>
+    <w:p>
+      <w:pPr>
+        <w:widowControl/>
+      </w:pPr>
+      <w:r>
+        <w:rPr>
+          <w:rFonts w:ascii="Liberation Sans" w:hAnsi="Liberation Sans"/>
+        </w:rPr>
+        <w:t>The accompanying readiness report separates data engineering readiness from causal readiness. A</w:t>
+      </w:r>
+    </w:p>
+    <w:p>
+      <w:pPr>
+        <w:widowControl/>
+      </w:pPr>
+      <w:r>
+        <w:rPr>
+          <w:rFonts w:ascii="Liberation Sans" w:hAnsi="Liberation Sans"/>
+        </w:rPr>
+        <w:t>complete, unique hourly table can be ready for descriptive proxy analysis while the identified</w:t>
+      </w:r>
+    </w:p>
+    <w:p>
+      <w:pPr>
+        <w:widowControl/>
+      </w:pPr>
+      <w:r>
+        <w:rPr>
+          <w:rFonts w:ascii="Liberation Sans" w:hAnsi="Liberation Sans"/>
+        </w:rPr>
+        <w:t>estimator remains blocked. Current blockers include historical-final rather than point-in-time</w:t>
+      </w:r>
+    </w:p>
+    <w:p>
+      <w:pPr>
+        <w:widowControl/>
+      </w:pPr>
+      <w:r>
+        <w:rPr>
+          <w:rFonts w:ascii="Liberation Sans" w:hAnsi="Liberation Sans"/>
+        </w:rPr>
+        <w:t>forecast vintages, missing historical weather forecasts, fuel and carbon prices, initial storage</w:t>
+      </w:r>
+    </w:p>
+    <w:p>
+      <w:pPr>
+        <w:widowControl/>
+      </w:pPr>
+      <w:r>
+        <w:rPr>
+          <w:rFonts w:ascii="Liberation Sans" w:hAnsi="Liberation Sans"/>
+        </w:rPr>
+        <w:t>state, incomplete historical coverage until the connected-zone backfill finishes, and an observed</w:t>
+      </w:r>
+    </w:p>
+    <w:p>
+      <w:pPr>
+        <w:widowControl/>
+      </w:pPr>
+      <w:r>
+        <w:rPr>
+          <w:rFonts w:ascii="Liberation Sans" w:hAnsi="Liberation Sans"/>
+        </w:rPr>
+        <w:t>workload intervention. This distinction prevents a clean dataset from being presented as proof of</w:t>
+      </w:r>
+    </w:p>
+    <w:p>
+      <w:pPr>
+        <w:widowControl/>
+      </w:pPr>
+      <w:r>
+        <w:rPr>
+          <w:rFonts w:ascii="Liberation Sans" w:hAnsi="Liberation Sans"/>
+        </w:rPr>
+        <w:t>causation.</w:t>
       </w:r>
     </w:p>
     <w:p>
@@ -3757,7 +4209,7 @@
         <w:rPr>
           <w:rFonts w:ascii="Liberation Sans" w:hAnsi="Liberation Sans"/>
         </w:rPr>
-        <w:t>Double Machine Learning</w:t>
+        <w:t>Constrained Marginal Response Regression</w:t>
       </w:r>
     </w:p>
     <w:p>
@@ -3768,18 +4220,7 @@
         <w:rPr>
           <w:rFonts w:ascii="Liberation Sans" w:hAnsi="Liberation Sans"/>
         </w:rPr>
-        <w:t>Double or debiased machine learning can estimate a low-dimensional treatment effect while flexible models learn the treatment and outcome nuisance functions. Orthogonal scores reduce sensitivity to nuisance-model error. Time-blocked cross-fitting is required because random folds would leak temporal structure.</w:t>
-      </w:r>
-    </w:p>
-    <w:p>
-      <w:pPr>
-        <w:widowControl/>
-      </w:pPr>
-      <w:r>
-        <w:rPr>
-          <w:rFonts w:ascii="Liberation Sans" w:hAnsi="Liberation Sans"/>
-        </w:rPr>
-        <w:t>Double machine learning does not create identification. Its causal interpretation still depends on the adjustment set, overlap, measurement, and absence of important unobserved confounding.</w:t>
+        <w:t>The first estimator should model how generation technologies and connected zones respond to changes in French net load while controlling for pre-decision conditions. Physical constraints can regularize the estimates. Total marginal response should approximately balance the demand change, subject to storage, losses, and imports. Sign and monotonicity assumptions must be tested by regime rather than imposed blindly.</w:t>
       </w:r>
     </w:p>
     <w:p>
@@ -3791,7 +4232,7 @@
         <w:rPr>
           <w:rFonts w:ascii="Liberation Sans" w:hAnsi="Liberation Sans"/>
         </w:rPr>
-        <w:t>Structural Dispatch Counterfactual</w:t>
+        <w:t>Double Machine Learning</w:t>
       </w:r>
     </w:p>
     <w:p>
@@ -3802,7 +4243,7 @@
         <w:rPr>
           <w:rFonts w:ascii="Liberation Sans" w:hAnsi="Liberation Sans"/>
         </w:rPr>
-        <w:t>A European dispatch or unit-commitment model can simulate the grid with and without the workload. PyPSA-Eur is a suitable open foundation. This approach represents transmission, generator constraints, storage, and cross-border response more directly than a simple statistical proxy.</w:t>
+        <w:t>Double or debiased machine learning can estimate a low-dimensional treatment effect while flexible models learn the treatment and outcome nuisance functions. Orthogonal scores reduce sensitivity to nuisance-model error. Time-blocked cross-fitting is required because random folds would leak temporal structure.</w:t>
       </w:r>
     </w:p>
     <w:p>
@@ -3813,7 +4254,7 @@
         <w:rPr>
           <w:rFonts w:ascii="Liberation Sans" w:hAnsi="Liberation Sans"/>
         </w:rPr>
-        <w:t>The strongest architecture triangulates an econometric estimate, a flexible DML estimate, and a structural dispatch counterfactual. Agreement increases confidence. Disagreement becomes model-risk evidence and may suppress the recommendation.</w:t>
+        <w:t>Double machine learning does not create identification. Its causal interpretation still depends on the adjustment set, overlap, measurement, and absence of important unobserved confounding.</w:t>
       </w:r>
     </w:p>
     <w:p>
@@ -3825,6 +4266,40 @@
         <w:rPr>
           <w:rFonts w:ascii="Liberation Sans" w:hAnsi="Liberation Sans"/>
         </w:rPr>
+        <w:t>Structural Dispatch Counterfactual</w:t>
+      </w:r>
+    </w:p>
+    <w:p>
+      <w:pPr>
+        <w:widowControl/>
+      </w:pPr>
+      <w:r>
+        <w:rPr>
+          <w:rFonts w:ascii="Liberation Sans" w:hAnsi="Liberation Sans"/>
+        </w:rPr>
+        <w:t>A European dispatch or unit-commitment model can simulate the grid with and without the workload. PyPSA-Eur is a suitable open foundation. This approach represents transmission, generator constraints, storage, and cross-border response more directly than a simple statistical proxy.</w:t>
+      </w:r>
+    </w:p>
+    <w:p>
+      <w:pPr>
+        <w:widowControl/>
+      </w:pPr>
+      <w:r>
+        <w:rPr>
+          <w:rFonts w:ascii="Liberation Sans" w:hAnsi="Liberation Sans"/>
+        </w:rPr>
+        <w:t>The strongest architecture triangulates an econometric estimate, a flexible DML estimate, and a structural dispatch counterfactual. Agreement increases confidence. Disagreement becomes model-risk evidence and may suppress the recommendation.</w:t>
+      </w:r>
+    </w:p>
+    <w:p>
+      <w:pPr>
+        <w:pStyle w:val="Heading2"/>
+        <w:keepNext/>
+      </w:pPr>
+      <w:r>
+        <w:rPr>
+          <w:rFonts w:ascii="Liberation Sans" w:hAnsi="Liberation Sans"/>
+        </w:rPr>
         <w:t>Falsification And Sensitivity</w:t>
       </w:r>
     </w:p>
@@ -3837,6 +4312,11 @@
           <w:rFonts w:ascii="Liberation Sans" w:hAnsi="Liberation Sans"/>
         </w:rPr>
         <w:t>Future workload changes should not explain earlier emissions. Lead and placebo tests should therefore be near zero. Negative controls can reveal residual confounding. Omitted-variable sensitivity analysis should report how strong an unmeasured confounder must be to overturn the result. Effects should also be stable across seasons, congestion states, outages, and renewable regimes.</w:t>
+      </w:r>
+    </w:p>
+    <w:p>
+      <w:r>
+        <w:br w:type="page"/>
       </w:r>
     </w:p>
     <w:p>
@@ -6744,6 +7224,142 @@
                 <w:rFonts w:ascii="Liberation Sans" w:hAnsi="Liberation Sans"/>
                 <w:sz w:val="17"/>
               </w:rPr>
+              <w:t>Causal feature mart</w:t>
+            </w:r>
+          </w:p>
+        </w:tc>
+        <w:tc>
+          <w:tcPr>
+            <w:tcW w:type="dxa" w:w="4939"/>
+            <w:vAlign w:val="center"/>
+            <w:tcMar>
+              <w:top w:w="90" w:type="dxa"/>
+              <w:start w:w="110" w:type="dxa"/>
+              <w:bottom w:w="90" w:type="dxa"/>
+              <w:end w:w="110" w:type="dxa"/>
+            </w:tcMar>
+            <w:shd w:fill="EDF4F1"/>
+          </w:tcPr>
+          <w:p>
+            <w:pPr>
+              <w:jc w:val="left"/>
+            </w:pPr>
+            <w:r>
+              <w:rPr>
+                <w:rFonts w:ascii="Liberation Mono" w:hAnsi="Liberation Mono"/>
+                <w:sz w:val="17"/>
+              </w:rPr>
+              <w:t>config/causal_feature_mart.json</w:t>
+            </w:r>
+            <w:r>
+              <w:rPr>
+                <w:rFonts w:ascii="Liberation Sans" w:hAnsi="Liberation Sans"/>
+                <w:sz w:val="17"/>
+              </w:rPr>
+              <w:t xml:space="preserve"> and </w:t>
+            </w:r>
+            <w:r>
+              <w:rPr>
+                <w:rFonts w:ascii="Liberation Mono" w:hAnsi="Liberation Mono"/>
+                <w:sz w:val="17"/>
+              </w:rPr>
+              <w:t>src/causal/feature_mart.py</w:t>
+            </w:r>
+          </w:p>
+        </w:tc>
+      </w:tr>
+      <w:tr>
+        <w:trPr>
+          <w:cantSplit/>
+        </w:trPr>
+        <w:tc>
+          <w:tcPr>
+            <w:tcW w:type="dxa" w:w="4939"/>
+            <w:vAlign w:val="center"/>
+            <w:tcMar>
+              <w:top w:w="90" w:type="dxa"/>
+              <w:start w:w="110" w:type="dxa"/>
+              <w:bottom w:w="90" w:type="dxa"/>
+              <w:end w:w="110" w:type="dxa"/>
+            </w:tcMar>
+          </w:tcPr>
+          <w:p>
+            <w:pPr>
+              <w:jc w:val="left"/>
+            </w:pPr>
+            <w:r>
+              <w:rPr>
+                <w:rFonts w:ascii="Liberation Sans" w:hAnsi="Liberation Sans"/>
+                <w:sz w:val="17"/>
+              </w:rPr>
+              <w:t>Connected-zone emissions</w:t>
+            </w:r>
+          </w:p>
+        </w:tc>
+        <w:tc>
+          <w:tcPr>
+            <w:tcW w:type="dxa" w:w="4939"/>
+            <w:vAlign w:val="center"/>
+            <w:tcMar>
+              <w:top w:w="90" w:type="dxa"/>
+              <w:start w:w="110" w:type="dxa"/>
+              <w:bottom w:w="90" w:type="dxa"/>
+              <w:end w:w="110" w:type="dxa"/>
+            </w:tcMar>
+          </w:tcPr>
+          <w:p>
+            <w:pPr>
+              <w:jc w:val="left"/>
+            </w:pPr>
+            <w:r>
+              <w:rPr>
+                <w:rFonts w:ascii="Liberation Mono" w:hAnsi="Liberation Mono"/>
+                <w:sz w:val="17"/>
+              </w:rPr>
+              <w:t>config/neighbor_emissions.json</w:t>
+            </w:r>
+            <w:r>
+              <w:rPr>
+                <w:rFonts w:ascii="Liberation Sans" w:hAnsi="Liberation Sans"/>
+                <w:sz w:val="17"/>
+              </w:rPr>
+              <w:t xml:space="preserve"> and </w:t>
+            </w:r>
+            <w:r>
+              <w:rPr>
+                <w:rFonts w:ascii="Liberation Mono" w:hAnsi="Liberation Mono"/>
+                <w:sz w:val="17"/>
+              </w:rPr>
+              <w:t>src/data/neighbor_emissions.py</w:t>
+            </w:r>
+          </w:p>
+        </w:tc>
+      </w:tr>
+      <w:tr>
+        <w:trPr>
+          <w:cantSplit/>
+        </w:trPr>
+        <w:tc>
+          <w:tcPr>
+            <w:tcW w:type="dxa" w:w="4939"/>
+            <w:vAlign w:val="center"/>
+            <w:tcMar>
+              <w:top w:w="90" w:type="dxa"/>
+              <w:start w:w="110" w:type="dxa"/>
+              <w:bottom w:w="90" w:type="dxa"/>
+              <w:end w:w="110" w:type="dxa"/>
+            </w:tcMar>
+            <w:shd w:fill="EDF4F1"/>
+          </w:tcPr>
+          <w:p>
+            <w:pPr>
+              <w:jc w:val="left"/>
+            </w:pPr>
+            <w:r>
+              <w:rPr>
+                <w:rFonts w:ascii="Liberation Sans" w:hAnsi="Liberation Sans"/>
+                <w:sz w:val="17"/>
+              </w:rPr>
               <w:t>Forecast monitoring</w:t>
             </w:r>
           </w:p>
@@ -7309,6 +7925,7 @@
     <w:tblPr>
       <w:tblW w:type="auto" w:w="0"/>
       <w:jc w:val="center"/>
+      <w:tblLayout w:type="fixed"/>
       <w:tblLook w:firstColumn="1" w:firstRow="1" w:lastColumn="0" w:lastRow="0" w:noHBand="0" w:noVBand="1" w:val="04A0"/>
       <w:tblBorders>
         <w:top w:val="nil"/>
@@ -7320,13 +7937,13 @@
       </w:tblBorders>
     </w:tblPr>
     <w:tblGrid>
-      <w:gridCol w:w="8352"/>
-      <w:gridCol w:w="1526"/>
+      <w:gridCol w:w="7704"/>
+      <w:gridCol w:w="1656"/>
     </w:tblGrid>
     <w:tr>
       <w:tc>
         <w:tcPr>
-          <w:tcW w:type="dxa" w:w="4939"/>
+          <w:tcW w:type="dxa" w:w="4680"/>
         </w:tcPr>
         <w:p>
           <w:pPr>
@@ -7344,7 +7961,7 @@
       </w:tc>
       <w:tc>
         <w:tcPr>
-          <w:tcW w:type="dxa" w:w="4939"/>
+          <w:tcW w:type="dxa" w:w="4680"/>
         </w:tcPr>
         <w:p>
           <w:pPr>

</xml_diff>